<commit_message>
Update team doc: meal-combo recommendation redesign, lite onboarding, InBody trend, workout Stage 1
Refreshes the status table and all affected sections to mark lite
onboarding, InBody measurement trend, and workout engine Stage 1 as
done, and rewrites section 1.4 to describe the new meal-combo +
goal-weighted + AI-coached recommendation engine. Section 4's open
decisions updated accordingly (workout Stage 2 instead of Stage 1,
removed resolved items).

Co-Authored-By: Claude Sonnet 5 <noreply@anthropic.com>
</commit_message>
<xml_diff>
--- a/docs/핏마스터AI_식단로직_향후과업.docx
+++ b/docs/핏마스터AI_식단로직_향후과업.docx
@@ -39,7 +39,7 @@
           <w:sz w:val="19"/>
           <w:szCs w:val="19"/>
         </w:rPr>
-        <w:t xml:space="preserve">작성일: 2026-10-02</w:t>
+        <w:t xml:space="preserve">작성일: 2026-10-02  ·  최종 수정: 2026-10-02 (식사 추천 개편, 간편 온보딩/InBody 추이/운동 1단계 반영)</w:t>
       </w:r>
     </w:p>
     <w:p>
@@ -190,7 +190,7 @@
                 <w:sz w:val="20"/>
                 <w:szCs w:val="20"/>
               </w:rPr>
-              <w:t xml:space="preserve">구현 완료</w:t>
+              <w:t xml:space="preserve">구현 완료 (최근 개편)</w:t>
             </w:r>
           </w:p>
         </w:tc>
@@ -212,7 +212,7 @@
                 <w:sz w:val="20"/>
                 <w:szCs w:val="20"/>
               </w:rPr>
-              <w:t xml:space="preserve">InBody 체성분(골격근량·체지방률 등)은 아직 계산식에 반영 안 됨</w:t>
+              <w:t xml:space="preserve">재료 단위 → 실제 식사 조합(24개)+목적 가중치+AI 코칭으로 개편. InBody 체성분(골격근량·체지방률 등)은 아직 계산식에 반영 안 됨</w:t>
             </w:r>
           </w:p>
         </w:tc>
@@ -440,7 +440,7 @@
                 <w:sz w:val="20"/>
                 <w:szCs w:val="20"/>
               </w:rPr>
-              <w:t xml:space="preserve">운동 추천 엔진</w:t>
+              <w:t xml:space="preserve">InBody 측정 추이 확인</w:t>
             </w:r>
           </w:p>
         </w:tc>
@@ -462,7 +462,7 @@
                 <w:sz w:val="20"/>
                 <w:szCs w:val="20"/>
               </w:rPr>
-              <w:t xml:space="preserve">설계만 완료, 미구현</w:t>
+              <w:t xml:space="preserve">구현 완료</w:t>
             </w:r>
           </w:p>
         </w:tc>
@@ -484,7 +484,7 @@
                 <w:sz w:val="20"/>
                 <w:szCs w:val="20"/>
               </w:rPr>
-              <w:t xml:space="preserve">본 문서 3장 — 3단계로 진행 예정</w:t>
+              <w:t xml:space="preserve">마이 탭에서 전체 측정 이력 + 약 2주 전 대비 변화(체중·골격근량·체지방량·체지방률) 확인 가능</w:t>
             </w:r>
           </w:p>
         </w:tc>
@@ -508,7 +508,7 @@
                 <w:sz w:val="20"/>
                 <w:szCs w:val="20"/>
               </w:rPr>
-              <w:t xml:space="preserve">동기부여 로드맵</w:t>
+              <w:t xml:space="preserve">간편 온보딩(키·체중만)</w:t>
             </w:r>
           </w:p>
         </w:tc>
@@ -530,7 +530,7 @@
                 <w:sz w:val="20"/>
                 <w:szCs w:val="20"/>
               </w:rPr>
-              <w:t xml:space="preserve">미착수</w:t>
+              <w:t xml:space="preserve">구현 완료</w:t>
             </w:r>
           </w:p>
         </w:tc>
@@ -552,7 +552,7 @@
                 <w:sz w:val="20"/>
                 <w:szCs w:val="20"/>
               </w:rPr>
-              <w:t xml:space="preserve">기획서 4대 기능 중 하나, 설계 자체가 아직 없음</w:t>
+              <w:t xml:space="preserve">InBody 없이도 성별·나이·키·체중만으로 온보딩 가능. 기초대사량은 Mifflin-St Jeor 공식으로 자동 추정</w:t>
             </w:r>
           </w:p>
         </w:tc>
@@ -576,7 +576,7 @@
                 <w:sz w:val="20"/>
                 <w:szCs w:val="20"/>
               </w:rPr>
-              <w:t xml:space="preserve">간편 온보딩(키·체중만)</w:t>
+              <w:t xml:space="preserve">운동 추천 엔진</w:t>
             </w:r>
           </w:p>
         </w:tc>
@@ -598,6 +598,74 @@
                 <w:sz w:val="20"/>
                 <w:szCs w:val="20"/>
               </w:rPr>
+              <w:t xml:space="preserve">1단계 구현 완료 (데이터 수집만)</w:t>
+            </w:r>
+          </w:p>
+        </w:tc>
+        <w:tc>
+          <w:tcPr>
+            <w:tcW w:type="dxa" w:w="5100"/>
+            <w:tcMar>
+              <w:top w:type="dxa" w:w="100"/>
+              <w:left w:type="dxa" w:w="120"/>
+              <w:bottom w:type="dxa" w:w="100"/>
+              <w:right w:type="dxa" w:w="120"/>
+            </w:tcMar>
+          </w:tcPr>
+          <w:p>
+            <w:r>
+              <w:rPr>
+                <w:b w:val="false"/>
+                <w:bCs w:val="false"/>
+                <w:sz w:val="20"/>
+                <w:szCs w:val="20"/>
+              </w:rPr>
+              <w:t xml:space="preserve">본 문서 3장 — WorkoutProfile·InBody 확장 필드·측정 히스토리까지 완료, 추천 로직(2~3단계)은 미착수</w:t>
+            </w:r>
+          </w:p>
+        </w:tc>
+      </w:tr>
+      <w:tr>
+        <w:tc>
+          <w:tcPr>
+            <w:tcW w:type="dxa" w:w="2600"/>
+            <w:tcMar>
+              <w:top w:type="dxa" w:w="100"/>
+              <w:left w:type="dxa" w:w="120"/>
+              <w:bottom w:type="dxa" w:w="100"/>
+              <w:right w:type="dxa" w:w="120"/>
+            </w:tcMar>
+          </w:tcPr>
+          <w:p>
+            <w:r>
+              <w:rPr>
+                <w:b w:val="false"/>
+                <w:bCs w:val="false"/>
+                <w:sz w:val="20"/>
+                <w:szCs w:val="20"/>
+              </w:rPr>
+              <w:t xml:space="preserve">동기부여 로드맵</w:t>
+            </w:r>
+          </w:p>
+        </w:tc>
+        <w:tc>
+          <w:tcPr>
+            <w:tcW w:type="dxa" w:w="2000"/>
+            <w:tcMar>
+              <w:top w:type="dxa" w:w="100"/>
+              <w:left w:type="dxa" w:w="120"/>
+              <w:bottom w:type="dxa" w:w="100"/>
+              <w:right w:type="dxa" w:w="120"/>
+            </w:tcMar>
+          </w:tcPr>
+          <w:p>
+            <w:r>
+              <w:rPr>
+                <w:b w:val="false"/>
+                <w:bCs w:val="false"/>
+                <w:sz w:val="20"/>
+                <w:szCs w:val="20"/>
+              </w:rPr>
               <w:t xml:space="preserve">미착수</w:t>
             </w:r>
           </w:p>
@@ -620,7 +688,7 @@
                 <w:sz w:val="20"/>
                 <w:szCs w:val="20"/>
               </w:rPr>
-              <w:t xml:space="preserve">기획서 타겟 유저와 범위 조율 필요</w:t>
+              <w:t xml:space="preserve">기획서 4대 기능 중 하나, 설계 자체가 아직 없음</w:t>
             </w:r>
           </w:p>
         </w:tc>
@@ -885,6 +953,23 @@
           <w:szCs w:val="21"/>
         </w:rPr>
         <w:t xml:space="preserve">단백질: 체중 × 1.2~1.8g/kg (목적별 차등) · 지방: 총 칼로리의 25% · 탄수화물: 나머지 · 식이섬유: 1,000kcal당 14g</w:t>
+      </w:r>
+    </w:p>
+    <w:p>
+      <w:pPr>
+        <w:pStyle w:val="ListParagraph"/>
+        <w:numPr>
+          <w:ilvl w:val="0"/>
+          <w:numId w:val="2"/>
+        </w:numPr>
+        <w:spacing w:after="60"/>
+      </w:pPr>
+      <w:r>
+        <w:rPr>
+          <w:sz w:val="21"/>
+          <w:szCs w:val="21"/>
+        </w:rPr>
+        <w:t xml:space="preserve">InBody 없이 온보딩한 경우(간편 온보딩) 기초대사량은 Mifflin-St Jeor 공식으로 자동 추정하고, "추정값" 표시를 해둔다. InBody 결과지를 나중에 올리면 실측값으로 바뀐다.</w:t>
       </w:r>
     </w:p>
     <w:p>
@@ -904,7 +989,7 @@
           <w:sz w:val="20"/>
           <w:szCs w:val="20"/>
         </w:rPr>
-        <w:t xml:space="preserve">※ 골격근량·체지방률 등 체성분 데이터는 현재 저장만 되고 이 계산식에는 반영되지 않는다. (2장 "향후 과업" 참고)</w:t>
+        <w:t xml:space="preserve">※ 골격근량·체지방률 등 체성분 데이터는 현재 저장·추이 확인(InBody 추이 기능)까지는 되지만, 이 계산식 자체에는 아직 반영되지 않는다.</w:t>
       </w:r>
     </w:p>
     <w:p>
@@ -953,7 +1038,58 @@
           <w:sz w:val="21"/>
           <w:szCs w:val="21"/>
         </w:rPr>
-        <w:t xml:space="preserve">추천 로직 — 달성률이 가장 낮은 매크로 순으로 정렬해, 해당 영양소가 풍부한 음식을 최대 4개까지 추천 (규칙 기반)</w:t>
+        <w:t xml:space="preserve">추천 로직(최근 개편) — 개별 재료가 아니라 실제 한 끼 조합(2~3가지 재료, 영양소별 6개씩 총 24개, src/data/mealCombos.ts)으로 추천한다.</w:t>
+      </w:r>
+    </w:p>
+    <w:p>
+      <w:pPr>
+        <w:pStyle w:val="ListParagraph"/>
+        <w:numPr>
+          <w:ilvl w:val="0"/>
+          <w:numId w:val="2"/>
+        </w:numPr>
+        <w:spacing w:after="60"/>
+      </w:pPr>
+      <w:r>
+        <w:rPr>
+          <w:sz w:val="21"/>
+          <w:szCs w:val="21"/>
+        </w:rPr>
+        <w:t xml:space="preserve">달성률이 가장 낮은 매크로를 우선하고, 같은 영양소를 채우는 조합이 여럿이면 사용자의 식단 목적(체지방감량/근육증가 등)과 맞는 조합을 먼저 보여준다.</w:t>
+      </w:r>
+    </w:p>
+    <w:p>
+      <w:pPr>
+        <w:pStyle w:val="ListParagraph"/>
+        <w:numPr>
+          <w:ilvl w:val="0"/>
+          <w:numId w:val="2"/>
+        </w:numPr>
+        <w:spacing w:after="60"/>
+      </w:pPr>
+      <w:r>
+        <w:rPr>
+          <w:sz w:val="21"/>
+          <w:szCs w:val="21"/>
+        </w:rPr>
+        <w:t xml:space="preserve">오늘 이미 먹은 재료로만 구성된 조합은 제외하고, 날짜 기준으로 추천 순서를 섞어 날마다 다른 조합이 나오게 한다. 최대 3개까지 보여준다.</w:t>
+      </w:r>
+    </w:p>
+    <w:p>
+      <w:pPr>
+        <w:pStyle w:val="ListParagraph"/>
+        <w:numPr>
+          <w:ilvl w:val="0"/>
+          <w:numId w:val="2"/>
+        </w:numPr>
+        <w:spacing w:after="60"/>
+      </w:pPr>
+      <w:r>
+        <w:rPr>
+          <w:sz w:val="21"/>
+          <w:szCs w:val="21"/>
+        </w:rPr>
+        <w:t xml:space="preserve">AI 코칭 문구 — 추천 카드의 버튼을 누르면 /api/coach-meal이 Claude를 호출해 "왜 이 조합을 추천했는지" 한두 문장으로 설명한다. 무엇을 추천할지는 전부 규칙 기반 로직이 먼저 결정하고, Claude는 그 결과를 설명만 한다(숫자·음식 재생성 없음). 대시보드 로딩 시 자동 호출하지 않고, 실패해도 기본 문구로 대체되어 추천 카드 자체는 항상 보인다.</w:t>
       </w:r>
     </w:p>
     <w:p>
@@ -973,7 +1109,7 @@
           <w:sz w:val="20"/>
           <w:szCs w:val="20"/>
         </w:rPr>
-        <w:t xml:space="preserve">※ 지금은 "오늘 섭취량"만 보고 추천한다. 체성분·운동 여부는 아직 반영되지 않는다.</w:t>
+        <w:t xml:space="preserve">※ 지금은 "오늘 섭취량"과 "오늘 식단 목적"만 보고 추천한다. 체성분(골격근량·체지방률)이나 운동 여부는 아직 반영되지 않는다.</w:t>
       </w:r>
     </w:p>
     <w:p>
@@ -1006,6 +1142,23 @@
           <w:szCs w:val="21"/>
         </w:rPr>
         <w:t xml:space="preserve">src/data/foodDatabase.ts — 한식/중식/일식/양식 등 약 200개 음식, 100g당 칼로리·단백질·탄수화물·지방·식이섬유 추정치</w:t>
+      </w:r>
+    </w:p>
+    <w:p>
+      <w:pPr>
+        <w:pStyle w:val="ListParagraph"/>
+        <w:numPr>
+          <w:ilvl w:val="0"/>
+          <w:numId w:val="2"/>
+        </w:numPr>
+        <w:spacing w:after="60"/>
+      </w:pPr>
+      <w:r>
+        <w:rPr>
+          <w:sz w:val="21"/>
+          <w:szCs w:val="21"/>
+        </w:rPr>
+        <w:t xml:space="preserve">src/data/mealCombos.ts — 위 음식 DB를 재료로 삼아 만든 24개 "한 끼 조합" 추천 풀 (재료 id+중량만 저장하고, 실제 영양 수치는 호출 시점에 계산)</w:t>
       </w:r>
     </w:p>
     <w:p>
@@ -1112,7 +1265,7 @@
           <w:sz w:val="24"/>
           <w:szCs w:val="24"/>
         </w:rPr>
-        <w:t xml:space="preserve">2.2 타겟 유저 정의 vs 간편 온보딩 요청</w:t>
+        <w:t xml:space="preserve">2.2 타겟 유저 정의 vs 간편 온보딩 요청 — 구현 완료</w:t>
       </w:r>
     </w:p>
     <w:p>
@@ -1136,7 +1289,7 @@
           <w:sz w:val="21"/>
           <w:szCs w:val="21"/>
         </w:rPr>
-        <w:t xml:space="preserve">최근 요청: InBody를 재본 적 없는 뉴비도 키·체중만으로 시작 가능하게</w:t>
+        <w:t xml:space="preserve">요청사항이었던 간편 온보딩(InBody 없이 키·체중·나이만으로 시작)을 구현했다. "InBody 있어요" / "아직 안 재봤어요" 두 모드를 온보딩에서 선택하고, 간편 모드는 기초대사량을 공식으로 추정한다.</w:t>
       </w:r>
     </w:p>
     <w:p>
@@ -1156,7 +1309,7 @@
           <w:sz w:val="20"/>
           <w:szCs w:val="20"/>
         </w:rPr>
-        <w:t xml:space="preserve">※ 간편 온보딩은 이탈 방지용 보조 경로로 유지하되, 피칭 데모의 메인 시나리오는 기획서 타겟(InBody 보유자)으로 유지하는 것을 제안한다.</w:t>
+        <w:t xml:space="preserve">※ 간편 온보딩은 이탈 방지용 보조 경로로 구현했고, 피칭 데모의 메인 시나리오는 기획서 타겟(InBody 보유자)으로 유지하는 것을 제안한다.</w:t>
       </w:r>
     </w:p>
     <w:p>
@@ -1295,7 +1448,7 @@
           <w:sz w:val="24"/>
           <w:szCs w:val="24"/>
         </w:rPr>
-        <w:t xml:space="preserve">3.1 데이터 모델</w:t>
+        <w:t xml:space="preserve">3.1 데이터 모델 — 1단계 구현 완료</w:t>
       </w:r>
     </w:p>
     <w:p>
@@ -1312,7 +1465,7 @@
           <w:sz w:val="21"/>
           <w:szCs w:val="21"/>
         </w:rPr>
-        <w:t xml:space="preserve">WorkoutProfile 신설 (운동목표/경험/주당횟수/1회시간/통증부위) — 식단 목적(Goal)과 분리해서 설계</w:t>
+        <w:t xml:space="preserve">WorkoutProfile 구현 완료 (운동목표/경험/주당횟수/1회시간/통증부위) — 식단 목적(Goal)과 분리해서 설계. 온보딩에서 수집하고 마이 탭에서 수정 가능.</w:t>
       </w:r>
     </w:p>
     <w:p>
@@ -1329,7 +1482,7 @@
           <w:sz w:val="21"/>
           <w:szCs w:val="21"/>
         </w:rPr>
-        <w:t xml:space="preserve">InBody: 체수분 · 단백질량 · 무기질량 필드 추가</w:t>
+        <w:t xml:space="preserve">InBody: 체수분 · 단백질량 · 무기질량 필드 추가 완료</w:t>
       </w:r>
     </w:p>
     <w:p>
@@ -1346,7 +1499,7 @@
           <w:sz w:val="21"/>
           <w:szCs w:val="21"/>
         </w:rPr>
-        <w:t xml:space="preserve">측정 히스토리 구조 추가 ("이전 측정 대비 변화" 반영을 위해 최신 값만이 아니라 기록을 누적)</w:t>
+        <w:t xml:space="preserve">측정 히스토리 구조 추가 완료 — 마이 탭에서 전체 이력과 "약 2주 전 대비 변화"를 바로 확인할 수 있다(InBody 측정 추이 기능).</w:t>
       </w:r>
     </w:p>
     <w:p>
@@ -1363,7 +1516,27 @@
           <w:sz w:val="21"/>
           <w:szCs w:val="21"/>
         </w:rPr>
-        <w:t xml:space="preserve">체형분류(C/I/D)는 AI가 사진에서 읽기보다, 골격근량·체지방량으로 앱이 직접 계산하는 방식을 우선 적용</w:t>
+        <w:t xml:space="preserve">체형분류(C/I/D)는 아직 미착수 — AI가 사진에서 읽기보다, 골격근량·체지방량으로 앱이 직접 계산하는 방식을 우선 적용할 예정</w:t>
+      </w:r>
+    </w:p>
+    <w:p>
+      <w:pPr>
+        <w:pBdr>
+          <w:left w:val="single" w:color="B45309" w:sz="24" w:space="8"/>
+        </w:pBdr>
+        <w:shd w:fill="FEF3C7" w:val="clear"/>
+        <w:spacing w:after="160" w:before="60"/>
+        <w:ind w:left="120"/>
+      </w:pPr>
+      <w:r>
+        <w:rPr>
+          <w:i/>
+          <w:iCs/>
+          <w:color w:val="B45309"/>
+          <w:sz w:val="20"/>
+          <w:szCs w:val="20"/>
+        </w:rPr>
+        <w:t xml:space="preserve">※ 1단계는 "데이터 수집"까지만이다. 이 데이터로 실제 운동 루틴을 추천하는 로직(2~3단계)은 아직 없다.</w:t>
       </w:r>
     </w:p>
     <w:p>
@@ -1378,7 +1551,7 @@
           <w:sz w:val="24"/>
           <w:szCs w:val="24"/>
         </w:rPr>
-        <w:t xml:space="preserve">3.2 추천 알고리즘 — "결정은 규칙 엔진, 설명은 LLM" 원칙</w:t>
+        <w:t xml:space="preserve">3.2 추천 알고리즘 — "결정은 규칙 엔진, 설명은 LLM" 원칙 (2~3단계, 미착수)</w:t>
       </w:r>
     </w:p>
     <w:p>
@@ -1390,7 +1563,7 @@
           <w:sz w:val="21"/>
           <w:szCs w:val="21"/>
         </w:rPr>
-        <w:t xml:space="preserve">식단 쪽에서 이미 쓰고 있는 원칙(AI는 음식만 식별, 영양소 숫자는 앱이 계산)과 동일한 구조를 운동 추천에도 적용한다. 운동 종목·세트·루틴은 규칙 기반 엔진이 결정하고, Claude는 그 결과를 설명·코칭하는 역할만 맡는다.</w:t>
+        <w:t xml:space="preserve">식단 쪽에서 이미 쓰고 있는 원칙(AI는 음식만 식별, 영양소 숫자는 앱이 계산 / 식사 조합도 규칙이 정하고 AI는 설명만)과 동일한 구조를 운동 추천에도 적용한다. 운동 종목·세트·루틴은 규칙 기반 엔진이 결정하고, Claude는 그 결과를 설명·코칭하는 역할만 맡는다.</w:t>
       </w:r>
     </w:p>
     <w:tbl>
@@ -1503,7 +1676,7 @@
                 <w:sz w:val="20"/>
                 <w:szCs w:val="20"/>
               </w:rPr>
-              <w:t xml:space="preserve">1단계</w:t>
+              <w:t xml:space="preserve">1단계 (완료)</w:t>
             </w:r>
           </w:p>
         </w:tc>
@@ -1547,7 +1720,7 @@
                 <w:sz w:val="20"/>
                 <w:szCs w:val="20"/>
               </w:rPr>
-              <w:t xml:space="preserve">WorkoutProfile 신설(목표/경험/횟수/시간/통증부위), InBody 체수분·단백질·무기질 필드, 측정 히스토리. 추천 로직 없음 — 데이터만 모음.</w:t>
+              <w:t xml:space="preserve">WorkoutProfile 신설(목표/경험/횟수/시간/통증부위), InBody 체수분·단백질·무기질 필드, 측정 히스토리 + 추이 확인. 추천 로직 없음 — 데이터만 모음.</w:t>
             </w:r>
           </w:p>
         </w:tc>
@@ -1571,7 +1744,7 @@
                 <w:sz w:val="20"/>
                 <w:szCs w:val="20"/>
               </w:rPr>
-              <w:t xml:space="preserve">2단계</w:t>
+              <w:t xml:space="preserve">2단계 (예정)</w:t>
             </w:r>
           </w:p>
         </w:tc>
@@ -1639,7 +1812,7 @@
                 <w:sz w:val="20"/>
                 <w:szCs w:val="20"/>
               </w:rPr>
-              <w:t xml:space="preserve">3단계</w:t>
+              <w:t xml:space="preserve">3단계 (예정)</w:t>
             </w:r>
           </w:p>
         </w:tc>
@@ -1701,7 +1874,7 @@
           <w:sz w:val="24"/>
           <w:szCs w:val="24"/>
         </w:rPr>
-        <w:t xml:space="preserve">3.3 확정된 온보딩 운동 질문 (5개)</w:t>
+        <w:t xml:space="preserve">3.3 확정된 온보딩 운동 질문 (5개) — 구현 완료</w:t>
       </w:r>
     </w:p>
     <w:p>
@@ -1806,7 +1979,7 @@
           <w:sz w:val="20"/>
           <w:szCs w:val="20"/>
         </w:rPr>
-        <w:t xml:space="preserve">※ 운동 환경(헬스장/홈트), 운동 선호도(머신/프리웨이트)는 범위에서 제외하기로 확정됨.</w:t>
+        <w:t xml:space="preserve">※ 운동 환경(헬스장/홈트), 운동 선호도(머신/프리웨이트)는 범위에서 제외하기로 확정됨. 5개 질문은 WorkoutProfileInput 컴포넌트로 구현되어 온보딩과 마이 탭에서 모두 쓰인다.</w:t>
       </w:r>
     </w:p>
     <w:p>
@@ -1880,7 +2053,7 @@
           <w:sz w:val="21"/>
           <w:szCs w:val="21"/>
         </w:rPr>
-        <w:t xml:space="preserve">간편 온보딩(키·체중만) 범위를 피칭 내러티브에 어떻게 넣을지</w:t>
+        <w:t xml:space="preserve">운동 추천 엔진 2단계(운동 후보 DB + 규칙 기반 필터링/점수화) 착수 여부</w:t>
       </w:r>
     </w:p>
     <w:p>
@@ -1897,7 +2070,7 @@
           <w:sz w:val="21"/>
           <w:szCs w:val="21"/>
         </w:rPr>
-        <w:t xml:space="preserve">운동 추천 엔진 1단계(데이터 모델 + 온보딩) 착수 여부</w:t>
+        <w:t xml:space="preserve">식단 추천에 체성분(골격근량·체지방률) 데이터를 실제로 반영할지 — 지금은 InBody 값이 저장·추이 확인까지만 되고 추천 로직에는 안 쓰인다</w:t>
       </w:r>
     </w:p>
     <w:sectPr>

</xml_diff>

<commit_message>
Update both diet docs for body-composition-aware target/recommendation logic
Reflects the lean-mass-based protein calculation, body-fat%-based
calorie nudge, BMI display, and meal-recommendation priority bias
shipped in c76977a. The focused doc's section 3/6.1 and the team doc's
status table/1.3/1.4/section 4 now accurately describe what body
composition data is and isn't used for, replacing the earlier "not
reflected yet" notes that this change resolved.

Co-Authored-By: Claude Sonnet 5 <noreply@anthropic.com>
</commit_message>
<xml_diff>
--- a/docs/핏마스터AI_식단로직_향후과업.docx
+++ b/docs/핏마스터AI_식단로직_향후과업.docx
@@ -39,7 +39,7 @@
           <w:sz w:val="19"/>
           <w:szCs w:val="19"/>
         </w:rPr>
-        <w:t xml:space="preserve">작성일: 2026-10-02  ·  최종 수정: 2026-10-02 (식사 추천 개편, 간편 온보딩/InBody 추이/운동 1단계 반영)</w:t>
+        <w:t xml:space="preserve">작성일: 2026-10-02  ·  최종 수정: 2026-10-02 (체성분 데이터를 영양 목표·식사 추천에 실제로 반영)</w:t>
       </w:r>
     </w:p>
     <w:p>
@@ -212,7 +212,7 @@
                 <w:sz w:val="20"/>
                 <w:szCs w:val="20"/>
               </w:rPr>
-              <w:t xml:space="preserve">재료 단위 → 실제 식사 조합(24개)+목적 가중치+AI 코칭으로 개편. InBody 체성분(골격근량·체지방률 등)은 아직 계산식에 반영 안 됨</w:t>
+              <w:t xml:space="preserve">재료 단위 → 실제 식사 조합(24개)+목적 가중치+AI 코칭으로 개편. 체지방량/체지방률이 단백질·칼로리 계산과 추천 순위에도 실제로 반영됨</w:t>
             </w:r>
           </w:p>
         </w:tc>
@@ -901,7 +901,7 @@
           <w:sz w:val="24"/>
           <w:szCs w:val="24"/>
         </w:rPr>
-        <w:t xml:space="preserve">1.3 개인 영양 목표 계산 (nutritionTargetService.ts)</w:t>
+        <w:t xml:space="preserve">1.3 개인 영양 목표 계산 (nutritionTargetService.ts) — 체성분 데이터 반영</w:t>
       </w:r>
     </w:p>
     <w:p>
@@ -918,7 +918,7 @@
           <w:sz w:val="21"/>
           <w:szCs w:val="21"/>
         </w:rPr>
-        <w:t xml:space="preserve">입력값: 기초대사량, 체중, 목적(체지방감량/근육증가/체중유지/건강관리)</w:t>
+        <w:t xml:space="preserve">입력값: 기초대사량, 체중, 체지방량/체지방률(있으면), 목적(체지방감량/근육증가/체중유지/건강관리)</w:t>
       </w:r>
     </w:p>
     <w:p>
@@ -952,7 +952,41 @@
           <w:sz w:val="21"/>
           <w:szCs w:val="21"/>
         </w:rPr>
-        <w:t xml:space="preserve">단백질: 체중 × 1.2~1.8g/kg (목적별 차등) · 지방: 총 칼로리의 25% · 탄수화물: 나머지 · 식이섬유: 1,000kcal당 14g</w:t>
+        <w:t xml:space="preserve">단백질 — 체지방량이 있으면 제지방량(체중−체지방량) × 1.6~2.2g/kg, 없으면(간편 온보딩) 체중 × 1.2~1.8g/kg. 단백질 필요량은 지방보다 근육·수분 등 제지방 조직에 더 좌우되기 때문이다.</w:t>
+      </w:r>
+    </w:p>
+    <w:p>
+      <w:pPr>
+        <w:pStyle w:val="ListParagraph"/>
+        <w:numPr>
+          <w:ilvl w:val="0"/>
+          <w:numId w:val="2"/>
+        </w:numPr>
+        <w:spacing w:after="60"/>
+      </w:pPr>
+      <w:r>
+        <w:rPr>
+          <w:sz w:val="21"/>
+          <w:szCs w:val="21"/>
+        </w:rPr>
+        <w:t xml:space="preserve">체지방률 보정(체지방감량 목적만) — 체지방률이 성별 기준 높은 편(남 25%↑/여 32%↑)이면 −50kcal, 낮은 편(남 12%↓/여 20%↓, 근손실 방지)이면 +50kcal. 보수적인 참고용 보정.</w:t>
+      </w:r>
+    </w:p>
+    <w:p>
+      <w:pPr>
+        <w:pStyle w:val="ListParagraph"/>
+        <w:numPr>
+          <w:ilvl w:val="0"/>
+          <w:numId w:val="2"/>
+        </w:numPr>
+        <w:spacing w:after="60"/>
+      </w:pPr>
+      <w:r>
+        <w:rPr>
+          <w:sz w:val="21"/>
+          <w:szCs w:val="21"/>
+        </w:rPr>
+        <w:t xml:space="preserve">지방: 총 칼로리의 25% · 탄수화물: 나머지 · 식이섬유: 1,000kcal당 14g</w:t>
       </w:r>
     </w:p>
     <w:p>
@@ -989,7 +1023,7 @@
           <w:sz w:val="20"/>
           <w:szCs w:val="20"/>
         </w:rPr>
-        <w:t xml:space="preserve">※ 골격근량·체지방률 등 체성분 데이터는 현재 저장·추이 확인(InBody 추이 기능)까지는 되지만, 이 계산식 자체에는 아직 반영되지 않는다.</w:t>
+        <w:t xml:space="preserve">※ 골격근량·체수분·단백질량·무기질량은 체지방량을 통해 "제지방량" 계산에 이미 간접 반영되므로 따로 공식에 넣지 않는다(중복 방지). BMI는 저장하지 않고 키·체중에서 그 자리에서 계산해 마이 탭에 참고용으로만 보여준다.</w:t>
       </w:r>
     </w:p>
     <w:p>
@@ -1056,6 +1090,23 @@
           <w:szCs w:val="21"/>
         </w:rPr>
         <w:t xml:space="preserve">달성률이 가장 낮은 매크로를 우선하고, 같은 영양소를 채우는 조합이 여럿이면 사용자의 식단 목적(체지방감량/근육증가 등)과 맞는 조합을 먼저 보여준다.</w:t>
+      </w:r>
+    </w:p>
+    <w:p>
+      <w:pPr>
+        <w:pStyle w:val="ListParagraph"/>
+        <w:numPr>
+          <w:ilvl w:val="0"/>
+          <w:numId w:val="2"/>
+        </w:numPr>
+        <w:spacing w:after="60"/>
+      </w:pPr>
+      <w:r>
+        <w:rPr>
+          <w:sz w:val="21"/>
+          <w:szCs w:val="21"/>
+        </w:rPr>
+        <w:t xml:space="preserve">체지방률 2차 가중치 — 체지방감량 목적+체지방률 높은 편이면, 같은 순위 안에서 단백질 조합을 저탄고단 쪽으로 더 우선시킨다. 화면에 보이는 실제 섭취율 숫자는 바꾸지 않는다.</w:t>
       </w:r>
     </w:p>
     <w:p>
@@ -1109,7 +1160,7 @@
           <w:sz w:val="20"/>
           <w:szCs w:val="20"/>
         </w:rPr>
-        <w:t xml:space="preserve">※ 지금은 "오늘 섭취량"과 "오늘 식단 목적"만 보고 추천한다. 체성분(골격근량·체지방률)이나 운동 여부는 아직 반영되지 않는다.</w:t>
+        <w:t xml:space="preserve">※ 골격근량은 아직 직접 쓰이지 않는다(체지방량 기반 제지방량 계산에 이미 간접 반영). 운동 여부(워크아웃 기록)도 아직 추천에 반영되지 않는다.</w:t>
       </w:r>
     </w:p>
     <w:p>
@@ -2070,7 +2121,24 @@
           <w:sz w:val="21"/>
           <w:szCs w:val="21"/>
         </w:rPr>
-        <w:t xml:space="preserve">식단 추천에 체성분(골격근량·체지방률) 데이터를 실제로 반영할지 — 지금은 InBody 값이 저장·추이 확인까지만 되고 추천 로직에는 안 쓰인다</w:t>
+        <w:t xml:space="preserve">체지방률 보정 임계값(남 25%/12%, 여 32%/20%)과 보정폭(±50kcal)이 적절한지 — 지금은 보수적으로 잡은 참고용 추정치라 영양 전문가 검토가 있으면 더 신뢰할 수 있다</w:t>
+      </w:r>
+    </w:p>
+    <w:p>
+      <w:pPr>
+        <w:pStyle w:val="ListParagraph"/>
+        <w:numPr>
+          <w:ilvl w:val="0"/>
+          <w:numId w:val="2"/>
+        </w:numPr>
+        <w:spacing w:after="60"/>
+      </w:pPr>
+      <w:r>
+        <w:rPr>
+          <w:sz w:val="21"/>
+          <w:szCs w:val="21"/>
+        </w:rPr>
+        <w:t xml:space="preserve">골격근량을 제지방량 계산과 별개로 직접 활용할지(예: 근육량 자체 추이에 따른 단백질 보정) — 지금은 체지방량 기반 제지방량에만 간접 반영된다</w:t>
       </w:r>
     </w:p>
     <w:sectPr>

</xml_diff>

<commit_message>
Update both diet docs for automatic goal-fit scoring (b6f87a6)
Replaces the "manually tagged" description of meal combo goal matching
with the actual computeGoalFit formula (protein:fat ratio, fiber
density, macro extremes) and documents its known limitation: it can't
distinguish good fat from bad fat, so some fat-heavy but genuinely
healthy combos (avocado toast) end up matching no goal. Added as a new
open item in the team doc's section 4 alongside the existing
body-fat% threshold caveat.

Co-Authored-By: Claude Sonnet 5 <noreply@anthropic.com>
</commit_message>
<xml_diff>
--- a/docs/핏마스터AI_식단로직_향후과업.docx
+++ b/docs/핏마스터AI_식단로직_향후과업.docx
@@ -39,7 +39,7 @@
           <w:sz w:val="19"/>
           <w:szCs w:val="19"/>
         </w:rPr>
-        <w:t xml:space="preserve">작성일: 2026-10-02  ·  최종 수정: 2026-10-02 (체성분 데이터를 영양 목표·식사 추천에 실제로 반영)</w:t>
+        <w:t xml:space="preserve">작성일: 2026-10-02  ·  최종 수정: 2026-10-02 (식사 조합의 목적 매칭을 수동 태그 → 자동 계산 방식으로 변경)</w:t>
       </w:r>
     </w:p>
     <w:p>
@@ -1106,6 +1106,23 @@
           <w:sz w:val="21"/>
           <w:szCs w:val="21"/>
         </w:rPr>
+        <w:t xml:space="preserve">목적 매칭은 수동 태그가 아니라 자동 계산 — 어떤 조합이 어떤 목적에 어울리는지 사람이 미리 정해두지 않고, 그 조합의 실제 단백질·지방·탄수화물·식이섬유 비율로 그때그때 판정한다(nutritionService.computeGoalFit). 예: 체지방감량엔 단백질÷지방 비율 1.2 이상 + 단백질 비중 25% 이상인 조합을 우선.</w:t>
+      </w:r>
+    </w:p>
+    <w:p>
+      <w:pPr>
+        <w:pStyle w:val="ListParagraph"/>
+        <w:numPr>
+          <w:ilvl w:val="0"/>
+          <w:numId w:val="2"/>
+        </w:numPr>
+        <w:spacing w:after="60"/>
+      </w:pPr>
+      <w:r>
+        <w:rPr>
+          <w:sz w:val="21"/>
+          <w:szCs w:val="21"/>
+        </w:rPr>
         <w:t xml:space="preserve">체지방률 2차 가중치 — 체지방감량 목적+체지방률 높은 편이면, 같은 순위 안에서 단백질 조합을 저탄고단 쪽으로 더 우선시킨다. 화면에 보이는 실제 섭취율 숫자는 바꾸지 않는다.</w:t>
       </w:r>
     </w:p>
@@ -2139,6 +2156,23 @@
           <w:szCs w:val="21"/>
         </w:rPr>
         <w:t xml:space="preserve">골격근량을 제지방량 계산과 별개로 직접 활용할지(예: 근육량 자체 추이에 따른 단백질 보정) — 지금은 체지방량 기반 제지방량에만 간접 반영된다</w:t>
+      </w:r>
+    </w:p>
+    <w:p>
+      <w:pPr>
+        <w:pStyle w:val="ListParagraph"/>
+        <w:numPr>
+          <w:ilvl w:val="0"/>
+          <w:numId w:val="2"/>
+        </w:numPr>
+        <w:spacing w:after="60"/>
+      </w:pPr>
+      <w:r>
+        <w:rPr>
+          <w:sz w:val="21"/>
+          <w:szCs w:val="21"/>
+        </w:rPr>
+        <w:t xml:space="preserve">식사 조합의 목적 매칭(computeGoalFit) 임계값도 같은 이유로 검토 필요 — 단백질÷지방 비율만으로는 "좋은 지방·나쁜 지방"을 구분 못 해서, 아보카도처럼 지방이 주력인 건강한 조합이 중립으로 빠지는 한계가 있다</w:t>
       </w:r>
     </w:p>
     <w:sectPr>

</xml_diff>

<commit_message>
Update both diet docs for the rate-based calorie formula (570698b)
Replaces the flat -300/+250/-100/0 kcal description with the actual
weekly-bodyweight-change-rate formula (0.5%/0.25%/TDEE-5%/0, with
body-fat% adjusting the fat_loss and muscle_gain rates) and the
+-750kcal safety clamp. Section 4's open-items list updated to ask
about the new rate values instead of the old flat-kcal nudge.

Co-Authored-By: Claude Sonnet 5 <noreply@anthropic.com>
</commit_message>
<xml_diff>
--- a/docs/핏마스터AI_식단로직_향후과업.docx
+++ b/docs/핏마스터AI_식단로직_향후과업.docx
@@ -39,7 +39,7 @@
           <w:sz w:val="19"/>
           <w:szCs w:val="19"/>
         </w:rPr>
-        <w:t xml:space="preserve">작성일: 2026-10-02  ·  최종 수정: 2026-10-02 (식사 조합의 목적 매칭을 수동 태그 → 자동 계산 방식으로 변경)</w:t>
+        <w:t xml:space="preserve">작성일: 2026-10-02  ·  최종 수정: 2026-10-02 (목적별 칼로리 보정을 고정 kcal → 체중 비례 변화율 공식으로 변경)</w:t>
       </w:r>
     </w:p>
     <w:p>
@@ -212,7 +212,7 @@
                 <w:sz w:val="20"/>
                 <w:szCs w:val="20"/>
               </w:rPr>
-              <w:t xml:space="preserve">재료 단위 → 실제 식사 조합(24개)+목적 가중치+AI 코칭으로 개편. 체지방량/체지방률이 단백질·칼로리 계산과 추천 순위에도 실제로 반영됨</w:t>
+              <w:t xml:space="preserve">재료 단위 → 실제 식사 조합(24개)+목적 가중치+AI 코칭으로 개편. 칼로리 보정도 고정 kcal에서 체중·체지방률 비례 변화율 공식으로 바뀜</w:t>
             </w:r>
           </w:p>
         </w:tc>
@@ -935,7 +935,58 @@
           <w:sz w:val="21"/>
           <w:szCs w:val="21"/>
         </w:rPr>
-        <w:t xml:space="preserve">활동계수 1.4 고정 → 목적별 칼로리 보정: 감량 −300 / 근육증가 +250 / 건강관리 −100 / 유지 0</w:t>
+        <w:t xml:space="preserve">활동계수 1.4 고정 → TDEE. 목적별 칼로리 보정은 더 이상 고정 kcal이 아니라, "주당 체중 변화율(%)" 목표를 체지방 1kg≈7,700kcal로 역산한 값이다 — 체중에 비례해서 스케일된다.</w:t>
+      </w:r>
+    </w:p>
+    <w:p>
+      <w:pPr>
+        <w:pStyle w:val="ListParagraph"/>
+        <w:numPr>
+          <w:ilvl w:val="0"/>
+          <w:numId w:val="2"/>
+        </w:numPr>
+        <w:spacing w:after="60"/>
+      </w:pPr>
+      <w:r>
+        <w:rPr>
+          <w:sz w:val="21"/>
+          <w:szCs w:val="21"/>
+        </w:rPr>
+        <w:t xml:space="preserve">체지방감량 0.5%/주(기본) · 근육증가 0.25%/주(기본) · 건강관리는 체중 변화 목표가 없어 TDEE의 −5% · 체중유지는 보정 없음.</w:t>
+      </w:r>
+    </w:p>
+    <w:p>
+      <w:pPr>
+        <w:pStyle w:val="ListParagraph"/>
+        <w:numPr>
+          <w:ilvl w:val="0"/>
+          <w:numId w:val="2"/>
+        </w:numPr>
+        <w:spacing w:after="60"/>
+      </w:pPr>
+      <w:r>
+        <w:rPr>
+          <w:sz w:val="21"/>
+          <w:szCs w:val="21"/>
+        </w:rPr>
+        <w:t xml:space="preserve">체지방률 데이터가 있으면 변화율 자체를 조정한다 — 체지방감량: 체지방률 높으면 0.7%/주, 낮으면 0.3%/주(근손실 방지). 근육증가: 체지방률 높으면 0.15%/주(과잉 지방 증가 억제).</w:t>
+      </w:r>
+    </w:p>
+    <w:p>
+      <w:pPr>
+        <w:pStyle w:val="ListParagraph"/>
+        <w:numPr>
+          <w:ilvl w:val="0"/>
+          <w:numId w:val="2"/>
+        </w:numPr>
+        <w:spacing w:after="60"/>
+      </w:pPr>
+      <w:r>
+        <w:rPr>
+          <w:sz w:val="21"/>
+          <w:szCs w:val="21"/>
+        </w:rPr>
+        <w:t xml:space="preserve">안전장치로 하루 보정폭은 ±750kcal를 넘지 않는다 — 체중이 매우 크거나 작아도 비현실적인 값이 나오지 않게 막는다.</w:t>
       </w:r>
     </w:p>
     <w:p>
@@ -953,23 +1004,6 @@
           <w:szCs w:val="21"/>
         </w:rPr>
         <w:t xml:space="preserve">단백질 — 체지방량이 있으면 제지방량(체중−체지방량) × 1.6~2.2g/kg, 없으면(간편 온보딩) 체중 × 1.2~1.8g/kg. 단백질 필요량은 지방보다 근육·수분 등 제지방 조직에 더 좌우되기 때문이다.</w:t>
-      </w:r>
-    </w:p>
-    <w:p>
-      <w:pPr>
-        <w:pStyle w:val="ListParagraph"/>
-        <w:numPr>
-          <w:ilvl w:val="0"/>
-          <w:numId w:val="2"/>
-        </w:numPr>
-        <w:spacing w:after="60"/>
-      </w:pPr>
-      <w:r>
-        <w:rPr>
-          <w:sz w:val="21"/>
-          <w:szCs w:val="21"/>
-        </w:rPr>
-        <w:t xml:space="preserve">체지방률 보정(체지방감량 목적만) — 체지방률이 성별 기준 높은 편(남 25%↑/여 32%↑)이면 −50kcal, 낮은 편(남 12%↓/여 20%↓, 근손실 방지)이면 +50kcal. 보수적인 참고용 보정.</w:t>
       </w:r>
     </w:p>
     <w:p>
@@ -2138,7 +2172,7 @@
           <w:sz w:val="21"/>
           <w:szCs w:val="21"/>
         </w:rPr>
-        <w:t xml:space="preserve">체지방률 보정 임계값(남 25%/12%, 여 32%/20%)과 보정폭(±50kcal)이 적절한지 — 지금은 보수적으로 잡은 참고용 추정치라 영양 전문가 검토가 있으면 더 신뢰할 수 있다</w:t>
+        <w:t xml:space="preserve">체지방률 임계값(남 25%/12%, 여 32%/20%)과 주당 변화율(0.5%/0.7%/0.3% 등)이 적절한지 — 스포츠영양학에서 흔히 인용되는 안전 범위를 썼지만 개인 대사 측정은 아니라, 영양 전문가 검토가 있으면 더 신뢰할 수 있다</w:t>
       </w:r>
     </w:p>
     <w:p>

</xml_diff>

<commit_message>
Update both diet docs for the meal combo pool expansion (fe934d2)
Replaces "24 combos" with the actual 156-combo pool: 24 hand-paired
ingredient combos + ~130 auto-converted single-dish combos from
foodDatabase.ts's 한식/중식/일식/양식/분식 categories (serving size
derived from each dish's calorie density, targeting ~500kcal per
portion; primaryNutrient classified by the same ratio rules as
computeGoalFit). Documents the kimchi/kkakdugi exclusion and the known
French-fries-as-fiber quirk from the ratio-only classifier.

Co-Authored-By: Claude Sonnet 5 <noreply@anthropic.com>
</commit_message>
<xml_diff>
--- a/docs/핏마스터AI_식단로직_향후과업.docx
+++ b/docs/핏마스터AI_식단로직_향후과업.docx
@@ -39,7 +39,7 @@
           <w:sz w:val="19"/>
           <w:szCs w:val="19"/>
         </w:rPr>
-        <w:t xml:space="preserve">작성일: 2026-10-02  ·  최종 수정: 2026-10-02 (목적별 칼로리 보정을 고정 kcal → 체중 비례 변화율 공식으로 변경)</w:t>
+        <w:t xml:space="preserve">작성일: 2026-10-02  ·  최종 수정: 2026-10-02 (식사 조합 풀을 24개 → 156개로 자동 확장)</w:t>
       </w:r>
     </w:p>
     <w:p>
@@ -212,7 +212,7 @@
                 <w:sz w:val="20"/>
                 <w:szCs w:val="20"/>
               </w:rPr>
-              <w:t xml:space="preserve">재료 단위 → 실제 식사 조합(24개)+목적 가중치+AI 코칭으로 개편. 칼로리 보정도 고정 kcal에서 체중·체지방률 비례 변화율 공식으로 바뀜</w:t>
+              <w:t xml:space="preserve">재료 단위 → 실제 식사 조합(156개, 자동 생성 포함)+목적 가중치+AI 코칭으로 개편. 칼로리 보정도 고정 kcal에서 체중·체지방률 비례 변화율 공식으로 바뀜</w:t>
             </w:r>
           </w:p>
         </w:tc>
@@ -1106,7 +1106,7 @@
           <w:sz w:val="21"/>
           <w:szCs w:val="21"/>
         </w:rPr>
-        <w:t xml:space="preserve">추천 로직(최근 개편) — 개별 재료가 아니라 실제 한 끼 조합(2~3가지 재료, 영양소별 6개씩 총 24개, src/data/mealCombos.ts)으로 추천한다.</w:t>
+        <w:t xml:space="preserve">추천 로직(최근 개편) — 개별 재료가 아니라 실제 한 끼 조합으로 추천한다. 풀은 총 156개(src/data/mealCombos.ts): 재료를 사람이 직접 짝지은 24개 + 한식/중식/일식/양식/분식 완성 요리(약 130개)를 "1인분 약 500kcal" 기준으로 자동 변환한 조합.</w:t>
       </w:r>
     </w:p>
     <w:p>
@@ -1260,7 +1260,7 @@
           <w:sz w:val="21"/>
           <w:szCs w:val="21"/>
         </w:rPr>
-        <w:t xml:space="preserve">src/data/mealCombos.ts — 위 음식 DB를 재료로 삼아 만든 24개 "한 끼 조합" 추천 풀 (재료 id+중량만 저장하고, 실제 영양 수치는 호출 시점에 계산)</w:t>
+        <w:t xml:space="preserve">src/data/mealCombos.ts — 위 음식 DB를 재료로 삼아 만든 156개 "한 끼 조합" 추천 풀 (재료 id+중량만 저장하고, 실제 영양 수치는 호출 시점에 계산). 한식/중식/일식/양식/분식 완성 요리는 자동 변환되므로 foodDatabase.ts에 음식이 추가되면 풀도 같이 늘어난다.</w:t>
       </w:r>
     </w:p>
     <w:p>

</xml_diff>